<commit_message>
Mentions légales : adresse de l'éditrice (domicile)
legal.adresseEditeur renseignée. L'adresse apparaît dans les mentions
légales, les conditions générales et les modèles de devis et de contrat
(régénérés) ; l'accueil, le contact et le pied de page n'affichent que
la ville.

Co-Authored-By: Claude Opus 5.5 <noreply@anthropic.com>
Claude-Session: https://claude.ai/code/session_01RpHF8nrcPTLKtwPSNGyhP8
</commit_message>
<xml_diff>
--- a/documents/modele-contrat.docx
+++ b/documents/modele-contrat.docx
@@ -47,29 +47,16 @@
     </w:p>
     <w:p>
       <w:pPr>
-        <w:tabs>
-          <w:tab w:val="right" w:pos="9826" w:leader="dot"/>
-        </w:tabs>
-        <w:spacing w:after="70" w:line="250"/>
-      </w:pPr>
-      <w:r>
-        <w:rPr>
-          <w:rFonts w:ascii="Arial" w:cs="Arial" w:eastAsia="Arial" w:hAnsi="Arial"/>
-          <w:b/>
-          <w:bCs/>
-          <w:sz w:val="18"/>
-          <w:szCs w:val="18"/>
-        </w:rPr>
-        <w:t xml:space="preserve">Adresse : </w:t>
-      </w:r>
-      <w:r>
-        <w:rPr>
-          <w:rFonts w:ascii="Arial" w:cs="Arial" w:eastAsia="Arial" w:hAnsi="Arial"/>
-          <w:color w:val="8A99A6"/>
-          <w:sz w:val="18"/>
-          <w:szCs w:val="18"/>
-        </w:rPr>
-        <w:t xml:space="preserve">	</w:t>
+        <w:spacing w:after="20"/>
+      </w:pPr>
+      <w:r>
+        <w:rPr>
+          <w:rFonts w:ascii="Arial" w:cs="Arial" w:eastAsia="Arial" w:hAnsi="Arial"/>
+          <w:color w:val="5B6B7A"/>
+          <w:sz w:val="18"/>
+          <w:szCs w:val="18"/>
+        </w:rPr>
+        <w:t xml:space="preserve">121 rue Marcel Pagnol, 16600 Ruelle-sur-Touvre</w:t>
       </w:r>
     </w:p>
     <w:p>
@@ -2870,7 +2857,7 @@
           <w:sz w:val="18"/>
           <w:szCs w:val="18"/>
         </w:rPr>
-        <w:t xml:space="preserve">À l'attention de Elisanah Mauricio EI – adresse indiquée en tête du devis – elisanahboukila@gmail.com :</w:t>
+        <w:t xml:space="preserve">À l'attention de Elisanah Mauricio EI – 121 rue Marcel Pagnol, 16600 Ruelle-sur-Touvre – elisanahboukila@gmail.com :</w:t>
       </w:r>
     </w:p>
     <w:p>

</xml_diff>

<commit_message>
Médiateur CM2C, prénom accentué, immatriculation RNE et code APE
- legal.mediateur : CM2C (adhésion valable jusqu'au 04/10/2029) ;
  affiché dans les mentions légales, les conditions générales et les
  modèles de devis et de contrat
- Prénom « Élisanah » conforme à l'inscription au guichet unique ; le
  monogramme du logo reste « EM » (nouvelle option identite.initiales)
- legal.registre : RNE ; legal.codeAPE : 81.21Z
- Modèles de devis et de contrat régénérés

Co-Authored-By: Claude Opus 5.5 <noreply@anthropic.com>
Claude-Session: https://claude.ai/code/session_01RpHF8nrcPTLKtwPSNGyhP8
</commit_message>
<xml_diff>
--- a/documents/modele-contrat.docx
+++ b/documents/modele-contrat.docx
@@ -28,7 +28,7 @@
           <w:sz w:val="18"/>
           <w:szCs w:val="18"/>
         </w:rPr>
-        <w:t xml:space="preserve">Elisanah Mauricio EI – Entrepreneure individuelle (EI) – micro-entrepreneure</w:t>
+        <w:t xml:space="preserve">Élisanah Mauricio EI – Entrepreneure individuelle (EI) – micro-entrepreneure</w:t>
       </w:r>
     </w:p>
     <w:p>
@@ -42,7 +42,7 @@
           <w:sz w:val="18"/>
           <w:szCs w:val="18"/>
         </w:rPr>
-        <w:t xml:space="preserve">SIRET 130 192 503 00014</w:t>
+        <w:t xml:space="preserve">SIRET 130 192 503 00014 – Immatriculée au Registre national des entreprises (RNE) – APE 81.21Z</w:t>
       </w:r>
     </w:p>
     <w:p>
@@ -130,7 +130,7 @@
           <w:sz w:val="18"/>
           <w:szCs w:val="18"/>
         </w:rPr>
-        <w:t xml:space="preserve">Elisanah Mauricio EI</w:t>
+        <w:t xml:space="preserve">Élisanah Mauricio EI</w:t>
       </w:r>
       <w:r>
         <w:rPr>
@@ -1983,10 +1983,7 @@
     </w:p>
     <w:p>
       <w:pPr>
-        <w:tabs>
-          <w:tab w:val="right" w:pos="9826" w:leader="dot"/>
-        </w:tabs>
-        <w:spacing w:after="70" w:line="250"/>
+        <w:spacing w:after="50" w:line="250"/>
       </w:pPr>
       <w:r>
         <w:rPr>
@@ -1996,16 +1993,15 @@
           <w:sz w:val="18"/>
           <w:szCs w:val="18"/>
         </w:rPr>
-        <w:t xml:space="preserve">Médiateur de la consommation (nom, adresse, site) : </w:t>
-      </w:r>
-      <w:r>
-        <w:rPr>
-          <w:rFonts w:ascii="Arial" w:cs="Arial" w:eastAsia="Arial" w:hAnsi="Arial"/>
-          <w:color w:val="8A99A6"/>
-          <w:sz w:val="18"/>
-          <w:szCs w:val="18"/>
-        </w:rPr>
-        <w:t xml:space="preserve">	</w:t>
+        <w:t xml:space="preserve">Médiateur de la consommation : </w:t>
+      </w:r>
+      <w:r>
+        <w:rPr>
+          <w:rFonts w:ascii="Arial" w:cs="Arial" w:eastAsia="Arial" w:hAnsi="Arial"/>
+          <w:sz w:val="18"/>
+          <w:szCs w:val="18"/>
+        </w:rPr>
+        <w:t xml:space="preserve">CM2C – Centre de la médiation de la consommation de conciliateurs de justice, 49 rue de Ponthieu, 75008 Paris – https://www.cm2c.net</w:t>
       </w:r>
     </w:p>
     <w:p>
@@ -2381,7 +2377,7 @@
                 <w:sz w:val="18"/>
                 <w:szCs w:val="18"/>
               </w:rPr>
-              <w:t xml:space="preserve">Elisanah Mauricio EI</w:t>
+              <w:t xml:space="preserve">Élisanah Mauricio EI</w:t>
             </w:r>
           </w:p>
           <w:p>
@@ -2857,7 +2853,7 @@
           <w:sz w:val="18"/>
           <w:szCs w:val="18"/>
         </w:rPr>
-        <w:t xml:space="preserve">À l'attention de Elisanah Mauricio EI – 121 rue Marcel Pagnol, 16600 Ruelle-sur-Touvre – elisanahboukila@gmail.com :</w:t>
+        <w:t xml:space="preserve">À l'attention de Élisanah Mauricio EI – 121 rue Marcel Pagnol, 16600 Ruelle-sur-Touvre – elisanahboukila@gmail.com :</w:t>
       </w:r>
     </w:p>
     <w:p>
@@ -3105,7 +3101,7 @@
         <w:sz w:val="15"/>
         <w:szCs w:val="15"/>
       </w:rPr>
-      <w:t xml:space="preserve">Essentiel Services – Elisanah Mauricio EI – SIRET 130 192 503 00014 – Contrat de prestation – page </w:t>
+      <w:t xml:space="preserve">Essentiel Services – Élisanah Mauricio EI – SIRET 130 192 503 00014 – Contrat de prestation – page </w:t>
     </w:r>
     <w:r>
       <w:rPr>

</xml_diff>

<commit_message>
Adresse pro contact@essentielservicescharente.fr et hébergeur OVH confirmé
- contact.email : contact@essentielservicescharente.fr (site, mentions légales, CGV, JSON-LD)
- Modèles de devis et de contrat (docx/pdf) régénérés avec la nouvelle adresse
- legal.hebergeur.confirme : supprime l'avertissement « valeur par défaut (OVH) »

Co-Authored-By: Claude Opus 5.5 <noreply@anthropic.com>
Claude-Session: https://claude.ai/code/session_01RpHF8nrcPTLKtwPSNGyhP8
</commit_message>
<xml_diff>
--- a/documents/modele-contrat.docx
+++ b/documents/modele-contrat.docx
@@ -70,7 +70,7 @@
           <w:sz w:val="18"/>
           <w:szCs w:val="18"/>
         </w:rPr>
-        <w:t xml:space="preserve">Tél. 07 45 37 00 74 – elisanahboukila@gmail.com</w:t>
+        <w:t xml:space="preserve">Tél. 07 45 37 00 74 – contact@essentielservicescharente.fr</w:t>
       </w:r>
     </w:p>
     <w:p>
@@ -2057,7 +2057,7 @@
           <w:sz w:val="18"/>
           <w:szCs w:val="18"/>
         </w:rPr>
-        <w:t xml:space="preserve">Les informations recueillies (coordonnées, consignes, renseignements de l'annexe) servent uniquement à l'exécution du contrat et à la facturation. Elles sont conservées pendant la durée du contrat puis le temps des obligations comptables, et les renseignements de santé éventuels sont détruits à la fin du contrat. Le Client peut exercer ses droits (accès, rectification, effacement…) à l'adresse elisanahboukila@gmail.com.</w:t>
+        <w:t xml:space="preserve">Les informations recueillies (coordonnées, consignes, renseignements de l'annexe) servent uniquement à l'exécution du contrat et à la facturation. Elles sont conservées pendant la durée du contrat puis le temps des obligations comptables, et les renseignements de santé éventuels sont détruits à la fin du contrat. Le Client peut exercer ses droits (accès, rectification, effacement…) à l'adresse contact@essentielservicescharente.fr.</w:t>
       </w:r>
     </w:p>
     <w:p>
@@ -2853,7 +2853,7 @@
           <w:sz w:val="18"/>
           <w:szCs w:val="18"/>
         </w:rPr>
-        <w:t xml:space="preserve">À l'attention de Élisanah Mauricio EI – 121 rue Marcel Pagnol, 16600 Ruelle-sur-Touvre – elisanahboukila@gmail.com :</w:t>
+        <w:t xml:space="preserve">À l'attention de Élisanah Mauricio EI – 121 rue Marcel Pagnol, 16600 Ruelle-sur-Touvre – contact@essentielservicescharente.fr :</w:t>
       </w:r>
     </w:p>
     <w:p>

</xml_diff>

<commit_message>
Retrait de l'aide aux seniors et correction du pied de page
- services : option actif:false (service conservé dans la config mais
  retiré du site) ; aide aux seniors désactivée (activité non déclarée)
- Textes : accueil, présentation, titre et descriptions SEO, crédit
  d'impôt, CGV, mentions légales, README sans référence aux seniors
- Modèles de devis et de contrat régénérés (fiche de renseignements)
- Pied de page : adresse e-mail coupée après « @ », « 25 km » insécable

Co-Authored-By: Claude Opus 5.5 <noreply@anthropic.com>
Claude-Session: https://claude.ai/code/session_01RpHF8nrcPTLKtwPSNGyhP8
</commit_message>
<xml_diff>
--- a/documents/modele-contrat.docx
+++ b/documents/modele-contrat.docx
@@ -572,22 +572,6 @@
           <w:szCs w:val="18"/>
         </w:rPr>
         <w:t xml:space="preserve">Ménage &amp; repassage     </w:t>
-      </w:r>
-      <w:r>
-        <w:rPr>
-          <w:rFonts w:ascii="Arial" w:cs="Arial" w:eastAsia="Arial" w:hAnsi="Arial"/>
-          <w:sz w:val="20"/>
-          <w:szCs w:val="20"/>
-        </w:rPr>
-        <w:t xml:space="preserve">☐ </w:t>
-      </w:r>
-      <w:r>
-        <w:rPr>
-          <w:rFonts w:ascii="Arial" w:cs="Arial" w:eastAsia="Arial" w:hAnsi="Arial"/>
-          <w:sz w:val="18"/>
-          <w:szCs w:val="18"/>
-        </w:rPr>
-        <w:t xml:space="preserve">Aide aux seniors     </w:t>
       </w:r>
       <w:r>
         <w:rPr>
@@ -1253,7 +1237,7 @@
                 <w:sz w:val="16"/>
                 <w:szCs w:val="16"/>
               </w:rPr>
-              <w:t xml:space="preserve">Aide aux seniors</w:t>
+              <w:t xml:space="preserve">Soutien scolaire</w:t>
             </w:r>
           </w:p>
         </w:tc>
@@ -1283,7 +1267,7 @@
                 <w:sz w:val="16"/>
                 <w:szCs w:val="16"/>
               </w:rPr>
-              <w:t xml:space="preserve">22 € / h</w:t>
+              <w:t xml:space="preserve">20 € / h</w:t>
             </w:r>
           </w:p>
         </w:tc>
@@ -1310,11 +1294,24 @@
             <w:r>
               <w:rPr>
                 <w:rFonts w:ascii="Arial" w:cs="Arial" w:eastAsia="Arial" w:hAnsi="Arial"/>
+                <w:sz w:val="16"/>
+                <w:szCs w:val="16"/>
+              </w:rPr>
+              <w:t xml:space="preserve">5 h : 95 € (19 €/h) · 10 h : 180 € (18 €/h) · 20 h : 340 € (17 €/h)</w:t>
+            </w:r>
+          </w:p>
+          <w:p>
+            <w:pPr>
+              <w:spacing w:after="50" w:line="250"/>
+            </w:pPr>
+            <w:r>
+              <w:rPr>
+                <w:rFonts w:ascii="Arial" w:cs="Arial" w:eastAsia="Arial" w:hAnsi="Arial"/>
                 <w:color w:val="5B6B7A"/>
                 <w:sz w:val="15"/>
                 <w:szCs w:val="15"/>
               </w:rPr>
-              <w:t xml:space="preserve">Séance minimale de 1 h 30. Produits et matériel fournis par le client.</w:t>
+              <w:t xml:space="preserve">Séance minimale de 1 h 30.</w:t>
             </w:r>
           </w:p>
         </w:tc>
@@ -1349,7 +1346,7 @@
                 <w:sz w:val="16"/>
                 <w:szCs w:val="16"/>
               </w:rPr>
-              <w:t xml:space="preserve">Soutien scolaire</w:t>
+              <w:t xml:space="preserve">Garde d'enfants</w:t>
             </w:r>
           </w:p>
         </w:tc>
@@ -1379,7 +1376,7 @@
                 <w:sz w:val="16"/>
                 <w:szCs w:val="16"/>
               </w:rPr>
-              <w:t xml:space="preserve">20 € / h</w:t>
+              <w:t xml:space="preserve">14 € / h</w:t>
             </w:r>
           </w:p>
         </w:tc>
@@ -1406,115 +1403,6 @@
             <w:r>
               <w:rPr>
                 <w:rFonts w:ascii="Arial" w:cs="Arial" w:eastAsia="Arial" w:hAnsi="Arial"/>
-                <w:sz w:val="16"/>
-                <w:szCs w:val="16"/>
-              </w:rPr>
-              <w:t xml:space="preserve">5 h : 95 € (19 €/h) · 10 h : 180 € (18 €/h) · 20 h : 340 € (17 €/h)</w:t>
-            </w:r>
-          </w:p>
-          <w:p>
-            <w:pPr>
-              <w:spacing w:after="50" w:line="250"/>
-            </w:pPr>
-            <w:r>
-              <w:rPr>
-                <w:rFonts w:ascii="Arial" w:cs="Arial" w:eastAsia="Arial" w:hAnsi="Arial"/>
-                <w:color w:val="5B6B7A"/>
-                <w:sz w:val="15"/>
-                <w:szCs w:val="15"/>
-              </w:rPr>
-              <w:t xml:space="preserve">Séance minimale de 1 h 30.</w:t>
-            </w:r>
-          </w:p>
-        </w:tc>
-      </w:tr>
-      <w:tr>
-        <w:trPr>
-          <w:cantSplit/>
-        </w:trPr>
-        <w:tc>
-          <w:tcPr>
-            <w:tcW w:type="dxa" w:w="3000"/>
-            <w:tcBorders>
-              <w:top w:val="single" w:color="C9D6D3" w:sz="4"/>
-              <w:left w:val="single" w:color="C9D6D3" w:sz="4"/>
-              <w:bottom w:val="single" w:color="C9D6D3" w:sz="4"/>
-              <w:right w:val="single" w:color="C9D6D3" w:sz="4"/>
-            </w:tcBorders>
-            <w:tcMar>
-              <w:top w:type="dxa" w:w="70"/>
-              <w:left w:type="dxa" w:w="110"/>
-              <w:bottom w:type="dxa" w:w="70"/>
-              <w:right w:type="dxa" w:w="110"/>
-            </w:tcMar>
-          </w:tcPr>
-          <w:p>
-            <w:pPr>
-              <w:spacing w:after="50" w:line="250"/>
-            </w:pPr>
-            <w:r>
-              <w:rPr>
-                <w:rFonts w:ascii="Arial" w:cs="Arial" w:eastAsia="Arial" w:hAnsi="Arial"/>
-                <w:sz w:val="16"/>
-                <w:szCs w:val="16"/>
-              </w:rPr>
-              <w:t xml:space="preserve">Garde d'enfants</w:t>
-            </w:r>
-          </w:p>
-        </w:tc>
-        <w:tc>
-          <w:tcPr>
-            <w:tcW w:type="dxa" w:w="1700"/>
-            <w:tcBorders>
-              <w:top w:val="single" w:color="C9D6D3" w:sz="4"/>
-              <w:left w:val="single" w:color="C9D6D3" w:sz="4"/>
-              <w:bottom w:val="single" w:color="C9D6D3" w:sz="4"/>
-              <w:right w:val="single" w:color="C9D6D3" w:sz="4"/>
-            </w:tcBorders>
-            <w:tcMar>
-              <w:top w:type="dxa" w:w="70"/>
-              <w:left w:type="dxa" w:w="110"/>
-              <w:bottom w:type="dxa" w:w="70"/>
-              <w:right w:type="dxa" w:w="110"/>
-            </w:tcMar>
-          </w:tcPr>
-          <w:p>
-            <w:pPr>
-              <w:spacing w:after="50" w:line="250"/>
-            </w:pPr>
-            <w:r>
-              <w:rPr>
-                <w:rFonts w:ascii="Arial" w:cs="Arial" w:eastAsia="Arial" w:hAnsi="Arial"/>
-                <w:sz w:val="16"/>
-                <w:szCs w:val="16"/>
-              </w:rPr>
-              <w:t xml:space="preserve">14 € / h</w:t>
-            </w:r>
-          </w:p>
-        </w:tc>
-        <w:tc>
-          <w:tcPr>
-            <w:tcW w:type="dxa" w:w="5166"/>
-            <w:tcBorders>
-              <w:top w:val="single" w:color="C9D6D3" w:sz="4"/>
-              <w:left w:val="single" w:color="C9D6D3" w:sz="4"/>
-              <w:bottom w:val="single" w:color="C9D6D3" w:sz="4"/>
-              <w:right w:val="single" w:color="C9D6D3" w:sz="4"/>
-            </w:tcBorders>
-            <w:tcMar>
-              <w:top w:type="dxa" w:w="70"/>
-              <w:left w:type="dxa" w:w="110"/>
-              <w:bottom w:type="dxa" w:w="70"/>
-              <w:right w:type="dxa" w:w="110"/>
-            </w:tcMar>
-          </w:tcPr>
-          <w:p>
-            <w:pPr>
-              <w:spacing w:after="50" w:line="250"/>
-            </w:pPr>
-            <w:r>
-              <w:rPr>
-                <w:rFonts w:ascii="Arial" w:cs="Arial" w:eastAsia="Arial" w:hAnsi="Arial"/>
                 <w:color w:val="5B6B7A"/>
                 <w:sz w:val="15"/>
                 <w:szCs w:val="15"/>
@@ -1748,7 +1636,7 @@
           <w:sz w:val="18"/>
           <w:szCs w:val="18"/>
         </w:rPr>
-        <w:t xml:space="preserve">Signaler toute consigne utile à la sécurité (zones fragiles, besoins particuliers de l'enfant ou de la personne âgée).</w:t>
+        <w:t xml:space="preserve">Signaler toute consigne utile à la sécurité (zones fragiles, besoins particuliers de l'enfant).</w:t>
       </w:r>
     </w:p>
     <w:p>
@@ -2663,103 +2551,6 @@
           <w:szCs w:val="18"/>
         </w:rPr>
         <w:t xml:space="preserve">J'autorise les sorties au parc et les trajets à pied vers les activités.</w:t>
-      </w:r>
-    </w:p>
-    <w:p>
-      <w:pPr>
-        <w:pStyle w:val="Heading2"/>
-        <w:keepNext/>
-        <w:spacing w:after="60" w:before="140"/>
-      </w:pPr>
-      <w:r>
-        <w:rPr>
-          <w:rFonts w:ascii="Georgia" w:cs="Georgia" w:eastAsia="Georgia" w:hAnsi="Georgia"/>
-          <w:color w:val="0F2A44"/>
-          <w:sz w:val="22"/>
-          <w:szCs w:val="22"/>
-        </w:rPr>
-        <w:t xml:space="preserve">Aide aux seniors</w:t>
-      </w:r>
-    </w:p>
-    <w:p>
-      <w:pPr>
-        <w:tabs>
-          <w:tab w:val="right" w:pos="9826" w:leader="dot"/>
-        </w:tabs>
-        <w:spacing w:after="70" w:line="250"/>
-      </w:pPr>
-      <w:r>
-        <w:rPr>
-          <w:rFonts w:ascii="Arial" w:cs="Arial" w:eastAsia="Arial" w:hAnsi="Arial"/>
-          <w:b/>
-          <w:bCs/>
-          <w:sz w:val="18"/>
-          <w:szCs w:val="18"/>
-        </w:rPr>
-        <w:t xml:space="preserve">Personne aidée (nom, âge) : </w:t>
-      </w:r>
-      <w:r>
-        <w:rPr>
-          <w:rFonts w:ascii="Arial" w:cs="Arial" w:eastAsia="Arial" w:hAnsi="Arial"/>
-          <w:color w:val="8A99A6"/>
-          <w:sz w:val="18"/>
-          <w:szCs w:val="18"/>
-        </w:rPr>
-        <w:t xml:space="preserve">	</w:t>
-      </w:r>
-    </w:p>
-    <w:p>
-      <w:pPr>
-        <w:tabs>
-          <w:tab w:val="right" w:pos="9826" w:leader="dot"/>
-        </w:tabs>
-        <w:spacing w:after="70" w:line="250"/>
-      </w:pPr>
-      <w:r>
-        <w:rPr>
-          <w:rFonts w:ascii="Arial" w:cs="Arial" w:eastAsia="Arial" w:hAnsi="Arial"/>
-          <w:b/>
-          <w:bCs/>
-          <w:sz w:val="18"/>
-          <w:szCs w:val="18"/>
-        </w:rPr>
-        <w:t xml:space="preserve">Membre de la famille à tenir informé (compte rendu) : </w:t>
-      </w:r>
-      <w:r>
-        <w:rPr>
-          <w:rFonts w:ascii="Arial" w:cs="Arial" w:eastAsia="Arial" w:hAnsi="Arial"/>
-          <w:color w:val="8A99A6"/>
-          <w:sz w:val="18"/>
-          <w:szCs w:val="18"/>
-        </w:rPr>
-        <w:t xml:space="preserve">	</w:t>
-      </w:r>
-    </w:p>
-    <w:p>
-      <w:pPr>
-        <w:tabs>
-          <w:tab w:val="right" w:pos="9826" w:leader="dot"/>
-        </w:tabs>
-        <w:spacing w:after="70" w:line="250"/>
-      </w:pPr>
-      <w:r>
-        <w:rPr>
-          <w:rFonts w:ascii="Arial" w:cs="Arial" w:eastAsia="Arial" w:hAnsi="Arial"/>
-          <w:b/>
-          <w:bCs/>
-          <w:sz w:val="18"/>
-          <w:szCs w:val="18"/>
-        </w:rPr>
-        <w:t xml:space="preserve">Précautions particulières : </w:t>
-      </w:r>
-      <w:r>
-        <w:rPr>
-          <w:rFonts w:ascii="Arial" w:cs="Arial" w:eastAsia="Arial" w:hAnsi="Arial"/>
-          <w:color w:val="8A99A6"/>
-          <w:sz w:val="18"/>
-          <w:szCs w:val="18"/>
-        </w:rPr>
-        <w:t xml:space="preserve">	</w:t>
       </w:r>
     </w:p>
     <w:p>

</xml_diff>

<commit_message>
Retrait de la garde d'enfants et du bandeau « en construction »
- Service garde d'enfants désactivé (actif: false)
- Textes, valeurs, titre et descriptions SEO, mots-clés, crédit d'impôt,
  CGV (article et engagement client, remise « plusieurs enfants ») et README
- Contrat : fiche de renseignements « Soutien scolaire » à la place de la
  garde d'enfants ; modèles régénérés
- site.enConstruction à false

Co-Authored-By: Claude Opus 5.5 <noreply@anthropic.com>
Claude-Session: https://claude.ai/code/session_01RpHF8nrcPTLKtwPSNGyhP8
</commit_message>
<xml_diff>
--- a/documents/modele-contrat.docx
+++ b/documents/modele-contrat.docx
@@ -589,22 +589,6 @@
         </w:rPr>
         <w:t xml:space="preserve">Soutien scolaire     </w:t>
       </w:r>
-      <w:r>
-        <w:rPr>
-          <w:rFonts w:ascii="Arial" w:cs="Arial" w:eastAsia="Arial" w:hAnsi="Arial"/>
-          <w:sz w:val="20"/>
-          <w:szCs w:val="20"/>
-        </w:rPr>
-        <w:t xml:space="preserve">☐ </w:t>
-      </w:r>
-      <w:r>
-        <w:rPr>
-          <w:rFonts w:ascii="Arial" w:cs="Arial" w:eastAsia="Arial" w:hAnsi="Arial"/>
-          <w:sz w:val="18"/>
-          <w:szCs w:val="18"/>
-        </w:rPr>
-        <w:t xml:space="preserve">Garde d'enfants     </w:t>
-      </w:r>
     </w:p>
     <w:p>
       <w:pPr>
@@ -692,7 +676,7 @@
           <w:sz w:val="18"/>
           <w:szCs w:val="18"/>
         </w:rPr>
-        <w:t xml:space="preserve">celles listées sur la page de chaque service du site et, en particulier, l'aide à la toilette, à l'habillage et au lever, les soins, la garde des enfants de moins de 3 ans, de nuit ou d'un enfant malade, le transport en voiture et les travaux en hauteur ou dangereux.</w:t>
+        <w:t xml:space="preserve">celles listées sur la page de chaque service du site et, en particulier, les soins, la garde d'enfants, le transport en voiture et les travaux en hauteur ou dangereux.</w:t>
       </w:r>
     </w:p>
     <w:p>
@@ -1316,102 +1300,6 @@
           </w:p>
         </w:tc>
       </w:tr>
-      <w:tr>
-        <w:trPr>
-          <w:cantSplit/>
-        </w:trPr>
-        <w:tc>
-          <w:tcPr>
-            <w:tcW w:type="dxa" w:w="3000"/>
-            <w:tcBorders>
-              <w:top w:val="single" w:color="C9D6D3" w:sz="4"/>
-              <w:left w:val="single" w:color="C9D6D3" w:sz="4"/>
-              <w:bottom w:val="single" w:color="C9D6D3" w:sz="4"/>
-              <w:right w:val="single" w:color="C9D6D3" w:sz="4"/>
-            </w:tcBorders>
-            <w:tcMar>
-              <w:top w:type="dxa" w:w="70"/>
-              <w:left w:type="dxa" w:w="110"/>
-              <w:bottom w:type="dxa" w:w="70"/>
-              <w:right w:type="dxa" w:w="110"/>
-            </w:tcMar>
-          </w:tcPr>
-          <w:p>
-            <w:pPr>
-              <w:spacing w:after="50" w:line="250"/>
-            </w:pPr>
-            <w:r>
-              <w:rPr>
-                <w:rFonts w:ascii="Arial" w:cs="Arial" w:eastAsia="Arial" w:hAnsi="Arial"/>
-                <w:sz w:val="16"/>
-                <w:szCs w:val="16"/>
-              </w:rPr>
-              <w:t xml:space="preserve">Garde d'enfants</w:t>
-            </w:r>
-          </w:p>
-        </w:tc>
-        <w:tc>
-          <w:tcPr>
-            <w:tcW w:type="dxa" w:w="1700"/>
-            <w:tcBorders>
-              <w:top w:val="single" w:color="C9D6D3" w:sz="4"/>
-              <w:left w:val="single" w:color="C9D6D3" w:sz="4"/>
-              <w:bottom w:val="single" w:color="C9D6D3" w:sz="4"/>
-              <w:right w:val="single" w:color="C9D6D3" w:sz="4"/>
-            </w:tcBorders>
-            <w:tcMar>
-              <w:top w:type="dxa" w:w="70"/>
-              <w:left w:type="dxa" w:w="110"/>
-              <w:bottom w:type="dxa" w:w="70"/>
-              <w:right w:type="dxa" w:w="110"/>
-            </w:tcMar>
-          </w:tcPr>
-          <w:p>
-            <w:pPr>
-              <w:spacing w:after="50" w:line="250"/>
-            </w:pPr>
-            <w:r>
-              <w:rPr>
-                <w:rFonts w:ascii="Arial" w:cs="Arial" w:eastAsia="Arial" w:hAnsi="Arial"/>
-                <w:sz w:val="16"/>
-                <w:szCs w:val="16"/>
-              </w:rPr>
-              <w:t xml:space="preserve">14 € / h</w:t>
-            </w:r>
-          </w:p>
-        </w:tc>
-        <w:tc>
-          <w:tcPr>
-            <w:tcW w:type="dxa" w:w="5166"/>
-            <w:tcBorders>
-              <w:top w:val="single" w:color="C9D6D3" w:sz="4"/>
-              <w:left w:val="single" w:color="C9D6D3" w:sz="4"/>
-              <w:bottom w:val="single" w:color="C9D6D3" w:sz="4"/>
-              <w:right w:val="single" w:color="C9D6D3" w:sz="4"/>
-            </w:tcBorders>
-            <w:tcMar>
-              <w:top w:type="dxa" w:w="70"/>
-              <w:left w:type="dxa" w:w="110"/>
-              <w:bottom w:type="dxa" w:w="70"/>
-              <w:right w:type="dxa" w:w="110"/>
-            </w:tcMar>
-          </w:tcPr>
-          <w:p>
-            <w:pPr>
-              <w:spacing w:after="50" w:line="250"/>
-            </w:pPr>
-            <w:r>
-              <w:rPr>
-                <w:rFonts w:ascii="Arial" w:cs="Arial" w:eastAsia="Arial" w:hAnsi="Arial"/>
-                <w:color w:val="5B6B7A"/>
-                <w:sz w:val="15"/>
-                <w:szCs w:val="15"/>
-              </w:rPr>
-              <w:t xml:space="preserve">Séance minimale de 1 h 30. 4 enfants au maximum ; tarif dégressif pour plusieurs enfants, indiqué sur le devis.</w:t>
-            </w:r>
-          </w:p>
-        </w:tc>
-      </w:tr>
     </w:tbl>
     <w:p>
       <w:pPr>
@@ -1637,24 +1525,6 @@
           <w:szCs w:val="18"/>
         </w:rPr>
         <w:t xml:space="preserve">Signaler toute consigne utile à la sécurité (zones fragiles, besoins particuliers de l'enfant).</w:t>
-      </w:r>
-    </w:p>
-    <w:p>
-      <w:pPr>
-        <w:pStyle w:val="ListParagraph"/>
-        <w:numPr>
-          <w:ilvl w:val="0"/>
-          <w:numId w:val="2"/>
-        </w:numPr>
-        <w:spacing w:after="30" w:line="250"/>
-      </w:pPr>
-      <w:r>
-        <w:rPr>
-          <w:rFonts w:ascii="Arial" w:cs="Arial" w:eastAsia="Arial" w:hAnsi="Arial"/>
-          <w:sz w:val="18"/>
-          <w:szCs w:val="18"/>
-        </w:rPr>
-        <w:t xml:space="preserve">Garde d'enfants : rester joignable pendant l'intervention, ou désigner une personne de confiance, et remplir la fiche de renseignements en annexe.</w:t>
       </w:r>
     </w:p>
     <w:p>
@@ -2431,7 +2301,7 @@
           <w:sz w:val="22"/>
           <w:szCs w:val="22"/>
         </w:rPr>
-        <w:t xml:space="preserve">Garde d'enfants</w:t>
+        <w:t xml:space="preserve">Soutien scolaire</w:t>
       </w:r>
     </w:p>
     <w:p>
@@ -2449,7 +2319,7 @@
           <w:sz w:val="18"/>
           <w:szCs w:val="18"/>
         </w:rPr>
-        <w:t xml:space="preserve">Prénom et âge de chaque enfant : </w:t>
+        <w:t xml:space="preserve">Prénom et classe de chaque enfant : </w:t>
       </w:r>
       <w:r>
         <w:rPr>
@@ -2493,7 +2363,7 @@
           <w:sz w:val="18"/>
           <w:szCs w:val="18"/>
         </w:rPr>
-        <w:t xml:space="preserve">Personnes autorisées à venir chercher l'enfant : </w:t>
+        <w:t xml:space="preserve">Matières, difficultés et objectifs : </w:t>
       </w:r>
       <w:r>
         <w:rPr>
@@ -2520,7 +2390,7 @@
           <w:sz w:val="18"/>
           <w:szCs w:val="18"/>
         </w:rPr>
-        <w:t xml:space="preserve">Allergies, consignes alimentaires ou médicales : </w:t>
+        <w:t xml:space="preserve">Adulte présent ou joignable pendant la séance : </w:t>
       </w:r>
       <w:r>
         <w:rPr>
@@ -2530,27 +2400,6 @@
           <w:szCs w:val="18"/>
         </w:rPr>
         <w:t xml:space="preserve">	</w:t>
-      </w:r>
-    </w:p>
-    <w:p>
-      <w:pPr>
-        <w:spacing w:after="50" w:line="250"/>
-      </w:pPr>
-      <w:r>
-        <w:rPr>
-          <w:rFonts w:ascii="Arial" w:cs="Arial" w:eastAsia="Arial" w:hAnsi="Arial"/>
-          <w:sz w:val="22"/>
-          <w:szCs w:val="22"/>
-        </w:rPr>
-        <w:t xml:space="preserve">☐  </w:t>
-      </w:r>
-      <w:r>
-        <w:rPr>
-          <w:rFonts w:ascii="Arial" w:cs="Arial" w:eastAsia="Arial" w:hAnsi="Arial"/>
-          <w:sz w:val="18"/>
-          <w:szCs w:val="18"/>
-        </w:rPr>
-        <w:t xml:space="preserve">J'autorise les sorties au parc et les trajets à pied vers les activités.</w:t>
       </w:r>
     </w:p>
     <w:p>

</xml_diff>

<commit_message>
Retrait temporaire du soutien scolaire (site ménage uniquement)
- Service soutien scolaire désactivé (actif: false), à réactiver plus tard :
  annuler ce commit (« Revert » de la PR) restaure l'état précédent
- Champ « Âge ou classe » du formulaire généré seulement si le soutien
  scolaire est proposé (contact.champClasse)
- Accueil, garanties, chiffres clés, valeurs, titres et descriptions SEO,
  mots-clés, tarifs, CGV, mentions légales recentrés sur le ménage
- Modèles de devis et de contrat régénérés

Co-Authored-By: Claude Opus 5.5 <noreply@anthropic.com>
Claude-Session: https://claude.ai/code/session_01RpHF8nrcPTLKtwPSNGyhP8
</commit_message>
<xml_diff>
--- a/documents/modele-contrat.docx
+++ b/documents/modele-contrat.docx
@@ -235,7 +235,7 @@
                 <w:sz w:val="18"/>
                 <w:szCs w:val="18"/>
               </w:rPr>
-              <w:t xml:space="preserve">Bénéficiaire, si différent (parent âgé, enfant)</w:t>
+              <w:t xml:space="preserve">Bénéficiaire, si différent</w:t>
             </w:r>
           </w:p>
         </w:tc>
@@ -441,7 +441,7 @@
                 <w:sz w:val="18"/>
                 <w:szCs w:val="18"/>
               </w:rPr>
-              <w:t xml:space="preserve">Âge ou classe (enfant) : </w:t>
+              <w:t xml:space="preserve">Lien avec le client : </w:t>
             </w:r>
             <w:r>
               <w:rPr>
@@ -468,7 +468,7 @@
                 <w:sz w:val="18"/>
                 <w:szCs w:val="18"/>
               </w:rPr>
-              <w:t xml:space="preserve">Lien avec le client : </w:t>
+              <w:t xml:space="preserve">Lieu d'intervention : </w:t>
             </w:r>
             <w:r>
               <w:rPr>
@@ -490,33 +490,6 @@
             <w:r>
               <w:rPr>
                 <w:rFonts w:ascii="Arial" w:cs="Arial" w:eastAsia="Arial" w:hAnsi="Arial"/>
-                <w:b/>
-                <w:bCs/>
-                <w:sz w:val="18"/>
-                <w:szCs w:val="18"/>
-              </w:rPr>
-              <w:t xml:space="preserve">Lieu d'intervention : </w:t>
-            </w:r>
-            <w:r>
-              <w:rPr>
-                <w:rFonts w:ascii="Arial" w:cs="Arial" w:eastAsia="Arial" w:hAnsi="Arial"/>
-                <w:color w:val="8A99A6"/>
-                <w:sz w:val="18"/>
-                <w:szCs w:val="18"/>
-              </w:rPr>
-              <w:t xml:space="preserve">	</w:t>
-            </w:r>
-          </w:p>
-          <w:p>
-            <w:pPr>
-              <w:tabs>
-                <w:tab w:val="right" w:pos="4673" w:leader="dot"/>
-              </w:tabs>
-              <w:spacing w:after="70" w:line="250"/>
-            </w:pPr>
-            <w:r>
-              <w:rPr>
-                <w:rFonts w:ascii="Arial" w:cs="Arial" w:eastAsia="Arial" w:hAnsi="Arial"/>
                 <w:color w:val="8A99A6"/>
                 <w:sz w:val="18"/>
                 <w:szCs w:val="18"/>
@@ -572,22 +545,6 @@
           <w:szCs w:val="18"/>
         </w:rPr>
         <w:t xml:space="preserve">Ménage     </w:t>
-      </w:r>
-      <w:r>
-        <w:rPr>
-          <w:rFonts w:ascii="Arial" w:cs="Arial" w:eastAsia="Arial" w:hAnsi="Arial"/>
-          <w:sz w:val="20"/>
-          <w:szCs w:val="20"/>
-        </w:rPr>
-        <w:t xml:space="preserve">☐ </w:t>
-      </w:r>
-      <w:r>
-        <w:rPr>
-          <w:rFonts w:ascii="Arial" w:cs="Arial" w:eastAsia="Arial" w:hAnsi="Arial"/>
-          <w:sz w:val="18"/>
-          <w:szCs w:val="18"/>
-        </w:rPr>
-        <w:t xml:space="preserve">Soutien scolaire     </w:t>
       </w:r>
     </w:p>
     <w:p>
@@ -1191,115 +1148,6 @@
           </w:p>
         </w:tc>
       </w:tr>
-      <w:tr>
-        <w:trPr>
-          <w:cantSplit/>
-        </w:trPr>
-        <w:tc>
-          <w:tcPr>
-            <w:tcW w:type="dxa" w:w="3000"/>
-            <w:tcBorders>
-              <w:top w:val="single" w:color="C9D6D3" w:sz="4"/>
-              <w:left w:val="single" w:color="C9D6D3" w:sz="4"/>
-              <w:bottom w:val="single" w:color="C9D6D3" w:sz="4"/>
-              <w:right w:val="single" w:color="C9D6D3" w:sz="4"/>
-            </w:tcBorders>
-            <w:tcMar>
-              <w:top w:type="dxa" w:w="70"/>
-              <w:left w:type="dxa" w:w="110"/>
-              <w:bottom w:type="dxa" w:w="70"/>
-              <w:right w:type="dxa" w:w="110"/>
-            </w:tcMar>
-          </w:tcPr>
-          <w:p>
-            <w:pPr>
-              <w:spacing w:after="50" w:line="250"/>
-            </w:pPr>
-            <w:r>
-              <w:rPr>
-                <w:rFonts w:ascii="Arial" w:cs="Arial" w:eastAsia="Arial" w:hAnsi="Arial"/>
-                <w:sz w:val="16"/>
-                <w:szCs w:val="16"/>
-              </w:rPr>
-              <w:t xml:space="preserve">Soutien scolaire</w:t>
-            </w:r>
-          </w:p>
-        </w:tc>
-        <w:tc>
-          <w:tcPr>
-            <w:tcW w:type="dxa" w:w="1700"/>
-            <w:tcBorders>
-              <w:top w:val="single" w:color="C9D6D3" w:sz="4"/>
-              <w:left w:val="single" w:color="C9D6D3" w:sz="4"/>
-              <w:bottom w:val="single" w:color="C9D6D3" w:sz="4"/>
-              <w:right w:val="single" w:color="C9D6D3" w:sz="4"/>
-            </w:tcBorders>
-            <w:tcMar>
-              <w:top w:type="dxa" w:w="70"/>
-              <w:left w:type="dxa" w:w="110"/>
-              <w:bottom w:type="dxa" w:w="70"/>
-              <w:right w:type="dxa" w:w="110"/>
-            </w:tcMar>
-          </w:tcPr>
-          <w:p>
-            <w:pPr>
-              <w:spacing w:after="50" w:line="250"/>
-            </w:pPr>
-            <w:r>
-              <w:rPr>
-                <w:rFonts w:ascii="Arial" w:cs="Arial" w:eastAsia="Arial" w:hAnsi="Arial"/>
-                <w:sz w:val="16"/>
-                <w:szCs w:val="16"/>
-              </w:rPr>
-              <w:t xml:space="preserve">20 € / h</w:t>
-            </w:r>
-          </w:p>
-        </w:tc>
-        <w:tc>
-          <w:tcPr>
-            <w:tcW w:type="dxa" w:w="5166"/>
-            <w:tcBorders>
-              <w:top w:val="single" w:color="C9D6D3" w:sz="4"/>
-              <w:left w:val="single" w:color="C9D6D3" w:sz="4"/>
-              <w:bottom w:val="single" w:color="C9D6D3" w:sz="4"/>
-              <w:right w:val="single" w:color="C9D6D3" w:sz="4"/>
-            </w:tcBorders>
-            <w:tcMar>
-              <w:top w:type="dxa" w:w="70"/>
-              <w:left w:type="dxa" w:w="110"/>
-              <w:bottom w:type="dxa" w:w="70"/>
-              <w:right w:type="dxa" w:w="110"/>
-            </w:tcMar>
-          </w:tcPr>
-          <w:p>
-            <w:pPr>
-              <w:spacing w:after="50" w:line="250"/>
-            </w:pPr>
-            <w:r>
-              <w:rPr>
-                <w:rFonts w:ascii="Arial" w:cs="Arial" w:eastAsia="Arial" w:hAnsi="Arial"/>
-                <w:sz w:val="16"/>
-                <w:szCs w:val="16"/>
-              </w:rPr>
-              <w:t xml:space="preserve">5 h : 95 € (19 €/h) · 10 h : 180 € (18 €/h) · 20 h : 340 € (17 €/h)</w:t>
-            </w:r>
-          </w:p>
-          <w:p>
-            <w:pPr>
-              <w:spacing w:after="50" w:line="250"/>
-            </w:pPr>
-            <w:r>
-              <w:rPr>
-                <w:rFonts w:ascii="Arial" w:cs="Arial" w:eastAsia="Arial" w:hAnsi="Arial"/>
-                <w:color w:val="5B6B7A"/>
-                <w:sz w:val="15"/>
-                <w:szCs w:val="15"/>
-              </w:rPr>
-              <w:t xml:space="preserve">Séance minimale de 1 h 30.</w:t>
-            </w:r>
-          </w:p>
-        </w:tc>
-      </w:tr>
     </w:tbl>
     <w:p>
       <w:pPr>
@@ -1524,7 +1372,23 @@
           <w:sz w:val="18"/>
           <w:szCs w:val="18"/>
         </w:rPr>
-        <w:t xml:space="preserve">Signaler toute consigne utile à la sécurité (zones fragiles, besoins particuliers de l'enfant).</w:t>
+        <w:t xml:space="preserve">Signaler toute consigne utile à la sécurité (zones fragiles, consignes particulières).</w:t>
+      </w:r>
+    </w:p>
+    <w:p>
+      <w:pPr>
+        <w:pStyle w:val="Heading2"/>
+        <w:keepNext/>
+        <w:spacing w:after="60" w:before="140"/>
+      </w:pPr>
+      <w:r>
+        <w:rPr>
+          <w:rFonts w:ascii="Georgia" w:cs="Georgia" w:eastAsia="Georgia" w:hAnsi="Georgia"/>
+          <w:color w:val="0F2A44"/>
+          <w:sz w:val="22"/>
+          <w:szCs w:val="22"/>
+        </w:rPr>
+        <w:t xml:space="preserve">Article 7 – Annulation, absence, report</w:t>
       </w:r>
     </w:p>
     <w:p>
@@ -1542,23 +1406,7 @@
           <w:sz w:val="18"/>
           <w:szCs w:val="18"/>
         </w:rPr>
-        <w:t xml:space="preserve">Soutien scolaire : fournir le matériel scolaire de l'enfant et informer la Prestataire de ses difficultés et de ses objectifs.</w:t>
-      </w:r>
-    </w:p>
-    <w:p>
-      <w:pPr>
-        <w:pStyle w:val="Heading2"/>
-        <w:keepNext/>
-        <w:spacing w:after="60" w:before="140"/>
-      </w:pPr>
-      <w:r>
-        <w:rPr>
-          <w:rFonts w:ascii="Georgia" w:cs="Georgia" w:eastAsia="Georgia" w:hAnsi="Georgia"/>
-          <w:color w:val="0F2A44"/>
-          <w:sz w:val="22"/>
-          <w:szCs w:val="22"/>
-        </w:rPr>
-        <w:t xml:space="preserve">Article 7 – Annulation, absence, report</w:t>
+        <w:t xml:space="preserve">Annulation ou report sans frais jusqu'à 24 heures avant l'intervention. Une première annulation tardive (moins de 24 heures avant) reste sans frais.</w:t>
       </w:r>
     </w:p>
     <w:p>
@@ -1576,7 +1424,7 @@
           <w:sz w:val="18"/>
           <w:szCs w:val="18"/>
         </w:rPr>
-        <w:t xml:space="preserve">Annulation ou report sans frais jusqu'à 24 heures avant l'intervention. Une première annulation tardive (moins de 24 heures avant) reste sans frais.</w:t>
+        <w:t xml:space="preserve">En cas d'annulations tardives répétées, ou d'annulation tardive ayant entraîné un déplacement inutile, 1 heure de prestation peut être facturée.</w:t>
       </w:r>
     </w:p>
     <w:p>
@@ -1594,24 +1442,6 @@
           <w:sz w:val="18"/>
           <w:szCs w:val="18"/>
         </w:rPr>
-        <w:t xml:space="preserve">En cas d'annulations tardives répétées, ou d'annulation tardive ayant entraîné un déplacement inutile, 1 heure de prestation peut être facturée.</w:t>
-      </w:r>
-    </w:p>
-    <w:p>
-      <w:pPr>
-        <w:pStyle w:val="ListParagraph"/>
-        <w:numPr>
-          <w:ilvl w:val="0"/>
-          <w:numId w:val="2"/>
-        </w:numPr>
-        <w:spacing w:after="30" w:line="250"/>
-      </w:pPr>
-      <w:r>
-        <w:rPr>
-          <w:rFonts w:ascii="Arial" w:cs="Arial" w:eastAsia="Arial" w:hAnsi="Arial"/>
-          <w:sz w:val="18"/>
-          <w:szCs w:val="18"/>
-        </w:rPr>
         <w:t xml:space="preserve">Si le Client est absent à l'heure prévue et que l'intervention ne peut pas être réalisée (par exemple faute d'accès au logement), 1 heure de prestation peut être facturée. La Prestataire privilégie toujours l'échange et la recherche d'une solution adaptée.</w:t>
       </w:r>
     </w:p>
@@ -1736,7 +1566,7 @@
           <w:sz w:val="18"/>
           <w:szCs w:val="18"/>
         </w:rPr>
-        <w:t xml:space="preserve">La Prestataire est responsable des dommages causés par sa faute dans l'exécution de la prestation. Tout dommage doit être signalé sans délai, de préférence dans les 48 heures. Le soutien scolaire est une aide au travail de l'enfant et ne garantit pas de résultats scolaires.</w:t>
+        <w:t xml:space="preserve">La Prestataire est responsable des dommages causés par sa faute dans l'exécution de la prestation. Tout dommage doit être signalé sans délai, de préférence dans les 48 heures.</w:t>
       </w:r>
     </w:p>
     <w:p>
@@ -2277,120 +2107,6 @@
           <w:szCs w:val="18"/>
         </w:rPr>
         <w:t xml:space="preserve">Nom, lien, téléphone : </w:t>
-      </w:r>
-      <w:r>
-        <w:rPr>
-          <w:rFonts w:ascii="Arial" w:cs="Arial" w:eastAsia="Arial" w:hAnsi="Arial"/>
-          <w:color w:val="8A99A6"/>
-          <w:sz w:val="18"/>
-          <w:szCs w:val="18"/>
-        </w:rPr>
-        <w:t xml:space="preserve">	</w:t>
-      </w:r>
-    </w:p>
-    <w:p>
-      <w:pPr>
-        <w:pStyle w:val="Heading2"/>
-        <w:keepNext/>
-        <w:spacing w:after="60" w:before="140"/>
-      </w:pPr>
-      <w:r>
-        <w:rPr>
-          <w:rFonts w:ascii="Georgia" w:cs="Georgia" w:eastAsia="Georgia" w:hAnsi="Georgia"/>
-          <w:color w:val="0F2A44"/>
-          <w:sz w:val="22"/>
-          <w:szCs w:val="22"/>
-        </w:rPr>
-        <w:t xml:space="preserve">Soutien scolaire</w:t>
-      </w:r>
-    </w:p>
-    <w:p>
-      <w:pPr>
-        <w:tabs>
-          <w:tab w:val="right" w:pos="9826" w:leader="dot"/>
-        </w:tabs>
-        <w:spacing w:after="70" w:line="250"/>
-      </w:pPr>
-      <w:r>
-        <w:rPr>
-          <w:rFonts w:ascii="Arial" w:cs="Arial" w:eastAsia="Arial" w:hAnsi="Arial"/>
-          <w:b/>
-          <w:bCs/>
-          <w:sz w:val="18"/>
-          <w:szCs w:val="18"/>
-        </w:rPr>
-        <w:t xml:space="preserve">Prénom et classe de chaque enfant : </w:t>
-      </w:r>
-      <w:r>
-        <w:rPr>
-          <w:rFonts w:ascii="Arial" w:cs="Arial" w:eastAsia="Arial" w:hAnsi="Arial"/>
-          <w:color w:val="8A99A6"/>
-          <w:sz w:val="18"/>
-          <w:szCs w:val="18"/>
-        </w:rPr>
-        <w:t xml:space="preserve">	</w:t>
-      </w:r>
-    </w:p>
-    <w:p>
-      <w:pPr>
-        <w:tabs>
-          <w:tab w:val="right" w:pos="9826" w:leader="dot"/>
-        </w:tabs>
-        <w:spacing w:after="70" w:line="250"/>
-      </w:pPr>
-      <w:r>
-        <w:rPr>
-          <w:rFonts w:ascii="Arial" w:cs="Arial" w:eastAsia="Arial" w:hAnsi="Arial"/>
-          <w:color w:val="8A99A6"/>
-          <w:sz w:val="18"/>
-          <w:szCs w:val="18"/>
-        </w:rPr>
-        <w:t xml:space="preserve">	</w:t>
-      </w:r>
-    </w:p>
-    <w:p>
-      <w:pPr>
-        <w:tabs>
-          <w:tab w:val="right" w:pos="9826" w:leader="dot"/>
-        </w:tabs>
-        <w:spacing w:after="70" w:line="250"/>
-      </w:pPr>
-      <w:r>
-        <w:rPr>
-          <w:rFonts w:ascii="Arial" w:cs="Arial" w:eastAsia="Arial" w:hAnsi="Arial"/>
-          <w:b/>
-          <w:bCs/>
-          <w:sz w:val="18"/>
-          <w:szCs w:val="18"/>
-        </w:rPr>
-        <w:t xml:space="preserve">Matières, difficultés et objectifs : </w:t>
-      </w:r>
-      <w:r>
-        <w:rPr>
-          <w:rFonts w:ascii="Arial" w:cs="Arial" w:eastAsia="Arial" w:hAnsi="Arial"/>
-          <w:color w:val="8A99A6"/>
-          <w:sz w:val="18"/>
-          <w:szCs w:val="18"/>
-        </w:rPr>
-        <w:t xml:space="preserve">	</w:t>
-      </w:r>
-    </w:p>
-    <w:p>
-      <w:pPr>
-        <w:tabs>
-          <w:tab w:val="right" w:pos="9826" w:leader="dot"/>
-        </w:tabs>
-        <w:spacing w:after="70" w:line="250"/>
-      </w:pPr>
-      <w:r>
-        <w:rPr>
-          <w:rFonts w:ascii="Arial" w:cs="Arial" w:eastAsia="Arial" w:hAnsi="Arial"/>
-          <w:b/>
-          <w:bCs/>
-          <w:sz w:val="18"/>
-          <w:szCs w:val="18"/>
-        </w:rPr>
-        <w:t xml:space="preserve">Adulte présent ou joignable pendant la séance : </w:t>
       </w:r>
       <w:r>
         <w:rPr>

</xml_diff>

<commit_message>
Retour du soutien scolaire (annulation de la PR #15)
Revert de 8c043ea : le soutien scolaire, ses textes, garanties, champ
« Âge ou classe », CGV, mentions légales et documents sont restaurés.

Co-Authored-By: Claude Opus 5.5 <noreply@anthropic.com>
Claude-Session: https://claude.ai/code/session_01RpHF8nrcPTLKtwPSNGyhP8
</commit_message>
<xml_diff>
--- a/documents/modele-contrat.docx
+++ b/documents/modele-contrat.docx
@@ -235,7 +235,7 @@
                 <w:sz w:val="18"/>
                 <w:szCs w:val="18"/>
               </w:rPr>
-              <w:t xml:space="preserve">Bénéficiaire, si différent</w:t>
+              <w:t xml:space="preserve">Bénéficiaire, si différent (parent âgé, enfant)</w:t>
             </w:r>
           </w:p>
         </w:tc>
@@ -441,7 +441,7 @@
                 <w:sz w:val="18"/>
                 <w:szCs w:val="18"/>
               </w:rPr>
-              <w:t xml:space="preserve">Lien avec le client : </w:t>
+              <w:t xml:space="preserve">Âge ou classe (enfant) : </w:t>
             </w:r>
             <w:r>
               <w:rPr>
@@ -468,7 +468,7 @@
                 <w:sz w:val="18"/>
                 <w:szCs w:val="18"/>
               </w:rPr>
-              <w:t xml:space="preserve">Lieu d'intervention : </w:t>
+              <w:t xml:space="preserve">Lien avec le client : </w:t>
             </w:r>
             <w:r>
               <w:rPr>
@@ -490,6 +490,33 @@
             <w:r>
               <w:rPr>
                 <w:rFonts w:ascii="Arial" w:cs="Arial" w:eastAsia="Arial" w:hAnsi="Arial"/>
+                <w:b/>
+                <w:bCs/>
+                <w:sz w:val="18"/>
+                <w:szCs w:val="18"/>
+              </w:rPr>
+              <w:t xml:space="preserve">Lieu d'intervention : </w:t>
+            </w:r>
+            <w:r>
+              <w:rPr>
+                <w:rFonts w:ascii="Arial" w:cs="Arial" w:eastAsia="Arial" w:hAnsi="Arial"/>
+                <w:color w:val="8A99A6"/>
+                <w:sz w:val="18"/>
+                <w:szCs w:val="18"/>
+              </w:rPr>
+              <w:t xml:space="preserve">	</w:t>
+            </w:r>
+          </w:p>
+          <w:p>
+            <w:pPr>
+              <w:tabs>
+                <w:tab w:val="right" w:pos="4673" w:leader="dot"/>
+              </w:tabs>
+              <w:spacing w:after="70" w:line="250"/>
+            </w:pPr>
+            <w:r>
+              <w:rPr>
+                <w:rFonts w:ascii="Arial" w:cs="Arial" w:eastAsia="Arial" w:hAnsi="Arial"/>
                 <w:color w:val="8A99A6"/>
                 <w:sz w:val="18"/>
                 <w:szCs w:val="18"/>
@@ -545,6 +572,22 @@
           <w:szCs w:val="18"/>
         </w:rPr>
         <w:t xml:space="preserve">Ménage     </w:t>
+      </w:r>
+      <w:r>
+        <w:rPr>
+          <w:rFonts w:ascii="Arial" w:cs="Arial" w:eastAsia="Arial" w:hAnsi="Arial"/>
+          <w:sz w:val="20"/>
+          <w:szCs w:val="20"/>
+        </w:rPr>
+        <w:t xml:space="preserve">☐ </w:t>
+      </w:r>
+      <w:r>
+        <w:rPr>
+          <w:rFonts w:ascii="Arial" w:cs="Arial" w:eastAsia="Arial" w:hAnsi="Arial"/>
+          <w:sz w:val="18"/>
+          <w:szCs w:val="18"/>
+        </w:rPr>
+        <w:t xml:space="preserve">Soutien scolaire     </w:t>
       </w:r>
     </w:p>
     <w:p>
@@ -1148,6 +1191,115 @@
           </w:p>
         </w:tc>
       </w:tr>
+      <w:tr>
+        <w:trPr>
+          <w:cantSplit/>
+        </w:trPr>
+        <w:tc>
+          <w:tcPr>
+            <w:tcW w:type="dxa" w:w="3000"/>
+            <w:tcBorders>
+              <w:top w:val="single" w:color="C9D6D3" w:sz="4"/>
+              <w:left w:val="single" w:color="C9D6D3" w:sz="4"/>
+              <w:bottom w:val="single" w:color="C9D6D3" w:sz="4"/>
+              <w:right w:val="single" w:color="C9D6D3" w:sz="4"/>
+            </w:tcBorders>
+            <w:tcMar>
+              <w:top w:type="dxa" w:w="70"/>
+              <w:left w:type="dxa" w:w="110"/>
+              <w:bottom w:type="dxa" w:w="70"/>
+              <w:right w:type="dxa" w:w="110"/>
+            </w:tcMar>
+          </w:tcPr>
+          <w:p>
+            <w:pPr>
+              <w:spacing w:after="50" w:line="250"/>
+            </w:pPr>
+            <w:r>
+              <w:rPr>
+                <w:rFonts w:ascii="Arial" w:cs="Arial" w:eastAsia="Arial" w:hAnsi="Arial"/>
+                <w:sz w:val="16"/>
+                <w:szCs w:val="16"/>
+              </w:rPr>
+              <w:t xml:space="preserve">Soutien scolaire</w:t>
+            </w:r>
+          </w:p>
+        </w:tc>
+        <w:tc>
+          <w:tcPr>
+            <w:tcW w:type="dxa" w:w="1700"/>
+            <w:tcBorders>
+              <w:top w:val="single" w:color="C9D6D3" w:sz="4"/>
+              <w:left w:val="single" w:color="C9D6D3" w:sz="4"/>
+              <w:bottom w:val="single" w:color="C9D6D3" w:sz="4"/>
+              <w:right w:val="single" w:color="C9D6D3" w:sz="4"/>
+            </w:tcBorders>
+            <w:tcMar>
+              <w:top w:type="dxa" w:w="70"/>
+              <w:left w:type="dxa" w:w="110"/>
+              <w:bottom w:type="dxa" w:w="70"/>
+              <w:right w:type="dxa" w:w="110"/>
+            </w:tcMar>
+          </w:tcPr>
+          <w:p>
+            <w:pPr>
+              <w:spacing w:after="50" w:line="250"/>
+            </w:pPr>
+            <w:r>
+              <w:rPr>
+                <w:rFonts w:ascii="Arial" w:cs="Arial" w:eastAsia="Arial" w:hAnsi="Arial"/>
+                <w:sz w:val="16"/>
+                <w:szCs w:val="16"/>
+              </w:rPr>
+              <w:t xml:space="preserve">20 € / h</w:t>
+            </w:r>
+          </w:p>
+        </w:tc>
+        <w:tc>
+          <w:tcPr>
+            <w:tcW w:type="dxa" w:w="5166"/>
+            <w:tcBorders>
+              <w:top w:val="single" w:color="C9D6D3" w:sz="4"/>
+              <w:left w:val="single" w:color="C9D6D3" w:sz="4"/>
+              <w:bottom w:val="single" w:color="C9D6D3" w:sz="4"/>
+              <w:right w:val="single" w:color="C9D6D3" w:sz="4"/>
+            </w:tcBorders>
+            <w:tcMar>
+              <w:top w:type="dxa" w:w="70"/>
+              <w:left w:type="dxa" w:w="110"/>
+              <w:bottom w:type="dxa" w:w="70"/>
+              <w:right w:type="dxa" w:w="110"/>
+            </w:tcMar>
+          </w:tcPr>
+          <w:p>
+            <w:pPr>
+              <w:spacing w:after="50" w:line="250"/>
+            </w:pPr>
+            <w:r>
+              <w:rPr>
+                <w:rFonts w:ascii="Arial" w:cs="Arial" w:eastAsia="Arial" w:hAnsi="Arial"/>
+                <w:sz w:val="16"/>
+                <w:szCs w:val="16"/>
+              </w:rPr>
+              <w:t xml:space="preserve">5 h : 95 € (19 €/h) · 10 h : 180 € (18 €/h) · 20 h : 340 € (17 €/h)</w:t>
+            </w:r>
+          </w:p>
+          <w:p>
+            <w:pPr>
+              <w:spacing w:after="50" w:line="250"/>
+            </w:pPr>
+            <w:r>
+              <w:rPr>
+                <w:rFonts w:ascii="Arial" w:cs="Arial" w:eastAsia="Arial" w:hAnsi="Arial"/>
+                <w:color w:val="5B6B7A"/>
+                <w:sz w:val="15"/>
+                <w:szCs w:val="15"/>
+              </w:rPr>
+              <w:t xml:space="preserve">Séance minimale de 1 h 30.</w:t>
+            </w:r>
+          </w:p>
+        </w:tc>
+      </w:tr>
     </w:tbl>
     <w:p>
       <w:pPr>
@@ -1372,23 +1524,7 @@
           <w:sz w:val="18"/>
           <w:szCs w:val="18"/>
         </w:rPr>
-        <w:t xml:space="preserve">Signaler toute consigne utile à la sécurité (zones fragiles, consignes particulières).</w:t>
-      </w:r>
-    </w:p>
-    <w:p>
-      <w:pPr>
-        <w:pStyle w:val="Heading2"/>
-        <w:keepNext/>
-        <w:spacing w:after="60" w:before="140"/>
-      </w:pPr>
-      <w:r>
-        <w:rPr>
-          <w:rFonts w:ascii="Georgia" w:cs="Georgia" w:eastAsia="Georgia" w:hAnsi="Georgia"/>
-          <w:color w:val="0F2A44"/>
-          <w:sz w:val="22"/>
-          <w:szCs w:val="22"/>
-        </w:rPr>
-        <w:t xml:space="preserve">Article 7 – Annulation, absence, report</w:t>
+        <w:t xml:space="preserve">Signaler toute consigne utile à la sécurité (zones fragiles, besoins particuliers de l'enfant).</w:t>
       </w:r>
     </w:p>
     <w:p>
@@ -1406,7 +1542,23 @@
           <w:sz w:val="18"/>
           <w:szCs w:val="18"/>
         </w:rPr>
-        <w:t xml:space="preserve">Annulation ou report sans frais jusqu'à 24 heures avant l'intervention. Une première annulation tardive (moins de 24 heures avant) reste sans frais.</w:t>
+        <w:t xml:space="preserve">Soutien scolaire : fournir le matériel scolaire de l'enfant et informer la Prestataire de ses difficultés et de ses objectifs.</w:t>
+      </w:r>
+    </w:p>
+    <w:p>
+      <w:pPr>
+        <w:pStyle w:val="Heading2"/>
+        <w:keepNext/>
+        <w:spacing w:after="60" w:before="140"/>
+      </w:pPr>
+      <w:r>
+        <w:rPr>
+          <w:rFonts w:ascii="Georgia" w:cs="Georgia" w:eastAsia="Georgia" w:hAnsi="Georgia"/>
+          <w:color w:val="0F2A44"/>
+          <w:sz w:val="22"/>
+          <w:szCs w:val="22"/>
+        </w:rPr>
+        <w:t xml:space="preserve">Article 7 – Annulation, absence, report</w:t>
       </w:r>
     </w:p>
     <w:p>
@@ -1424,7 +1576,7 @@
           <w:sz w:val="18"/>
           <w:szCs w:val="18"/>
         </w:rPr>
-        <w:t xml:space="preserve">En cas d'annulations tardives répétées, ou d'annulation tardive ayant entraîné un déplacement inutile, 1 heure de prestation peut être facturée.</w:t>
+        <w:t xml:space="preserve">Annulation ou report sans frais jusqu'à 24 heures avant l'intervention. Une première annulation tardive (moins de 24 heures avant) reste sans frais.</w:t>
       </w:r>
     </w:p>
     <w:p>
@@ -1442,6 +1594,24 @@
           <w:sz w:val="18"/>
           <w:szCs w:val="18"/>
         </w:rPr>
+        <w:t xml:space="preserve">En cas d'annulations tardives répétées, ou d'annulation tardive ayant entraîné un déplacement inutile, 1 heure de prestation peut être facturée.</w:t>
+      </w:r>
+    </w:p>
+    <w:p>
+      <w:pPr>
+        <w:pStyle w:val="ListParagraph"/>
+        <w:numPr>
+          <w:ilvl w:val="0"/>
+          <w:numId w:val="2"/>
+        </w:numPr>
+        <w:spacing w:after="30" w:line="250"/>
+      </w:pPr>
+      <w:r>
+        <w:rPr>
+          <w:rFonts w:ascii="Arial" w:cs="Arial" w:eastAsia="Arial" w:hAnsi="Arial"/>
+          <w:sz w:val="18"/>
+          <w:szCs w:val="18"/>
+        </w:rPr>
         <w:t xml:space="preserve">Si le Client est absent à l'heure prévue et que l'intervention ne peut pas être réalisée (par exemple faute d'accès au logement), 1 heure de prestation peut être facturée. La Prestataire privilégie toujours l'échange et la recherche d'une solution adaptée.</w:t>
       </w:r>
     </w:p>
@@ -1566,7 +1736,7 @@
           <w:sz w:val="18"/>
           <w:szCs w:val="18"/>
         </w:rPr>
-        <w:t xml:space="preserve">La Prestataire est responsable des dommages causés par sa faute dans l'exécution de la prestation. Tout dommage doit être signalé sans délai, de préférence dans les 48 heures.</w:t>
+        <w:t xml:space="preserve">La Prestataire est responsable des dommages causés par sa faute dans l'exécution de la prestation. Tout dommage doit être signalé sans délai, de préférence dans les 48 heures. Le soutien scolaire est une aide au travail de l'enfant et ne garantit pas de résultats scolaires.</w:t>
       </w:r>
     </w:p>
     <w:p>
@@ -2107,6 +2277,120 @@
           <w:szCs w:val="18"/>
         </w:rPr>
         <w:t xml:space="preserve">Nom, lien, téléphone : </w:t>
+      </w:r>
+      <w:r>
+        <w:rPr>
+          <w:rFonts w:ascii="Arial" w:cs="Arial" w:eastAsia="Arial" w:hAnsi="Arial"/>
+          <w:color w:val="8A99A6"/>
+          <w:sz w:val="18"/>
+          <w:szCs w:val="18"/>
+        </w:rPr>
+        <w:t xml:space="preserve">	</w:t>
+      </w:r>
+    </w:p>
+    <w:p>
+      <w:pPr>
+        <w:pStyle w:val="Heading2"/>
+        <w:keepNext/>
+        <w:spacing w:after="60" w:before="140"/>
+      </w:pPr>
+      <w:r>
+        <w:rPr>
+          <w:rFonts w:ascii="Georgia" w:cs="Georgia" w:eastAsia="Georgia" w:hAnsi="Georgia"/>
+          <w:color w:val="0F2A44"/>
+          <w:sz w:val="22"/>
+          <w:szCs w:val="22"/>
+        </w:rPr>
+        <w:t xml:space="preserve">Soutien scolaire</w:t>
+      </w:r>
+    </w:p>
+    <w:p>
+      <w:pPr>
+        <w:tabs>
+          <w:tab w:val="right" w:pos="9826" w:leader="dot"/>
+        </w:tabs>
+        <w:spacing w:after="70" w:line="250"/>
+      </w:pPr>
+      <w:r>
+        <w:rPr>
+          <w:rFonts w:ascii="Arial" w:cs="Arial" w:eastAsia="Arial" w:hAnsi="Arial"/>
+          <w:b/>
+          <w:bCs/>
+          <w:sz w:val="18"/>
+          <w:szCs w:val="18"/>
+        </w:rPr>
+        <w:t xml:space="preserve">Prénom et classe de chaque enfant : </w:t>
+      </w:r>
+      <w:r>
+        <w:rPr>
+          <w:rFonts w:ascii="Arial" w:cs="Arial" w:eastAsia="Arial" w:hAnsi="Arial"/>
+          <w:color w:val="8A99A6"/>
+          <w:sz w:val="18"/>
+          <w:szCs w:val="18"/>
+        </w:rPr>
+        <w:t xml:space="preserve">	</w:t>
+      </w:r>
+    </w:p>
+    <w:p>
+      <w:pPr>
+        <w:tabs>
+          <w:tab w:val="right" w:pos="9826" w:leader="dot"/>
+        </w:tabs>
+        <w:spacing w:after="70" w:line="250"/>
+      </w:pPr>
+      <w:r>
+        <w:rPr>
+          <w:rFonts w:ascii="Arial" w:cs="Arial" w:eastAsia="Arial" w:hAnsi="Arial"/>
+          <w:color w:val="8A99A6"/>
+          <w:sz w:val="18"/>
+          <w:szCs w:val="18"/>
+        </w:rPr>
+        <w:t xml:space="preserve">	</w:t>
+      </w:r>
+    </w:p>
+    <w:p>
+      <w:pPr>
+        <w:tabs>
+          <w:tab w:val="right" w:pos="9826" w:leader="dot"/>
+        </w:tabs>
+        <w:spacing w:after="70" w:line="250"/>
+      </w:pPr>
+      <w:r>
+        <w:rPr>
+          <w:rFonts w:ascii="Arial" w:cs="Arial" w:eastAsia="Arial" w:hAnsi="Arial"/>
+          <w:b/>
+          <w:bCs/>
+          <w:sz w:val="18"/>
+          <w:szCs w:val="18"/>
+        </w:rPr>
+        <w:t xml:space="preserve">Matières, difficultés et objectifs : </w:t>
+      </w:r>
+      <w:r>
+        <w:rPr>
+          <w:rFonts w:ascii="Arial" w:cs="Arial" w:eastAsia="Arial" w:hAnsi="Arial"/>
+          <w:color w:val="8A99A6"/>
+          <w:sz w:val="18"/>
+          <w:szCs w:val="18"/>
+        </w:rPr>
+        <w:t xml:space="preserve">	</w:t>
+      </w:r>
+    </w:p>
+    <w:p>
+      <w:pPr>
+        <w:tabs>
+          <w:tab w:val="right" w:pos="9826" w:leader="dot"/>
+        </w:tabs>
+        <w:spacing w:after="70" w:line="250"/>
+      </w:pPr>
+      <w:r>
+        <w:rPr>
+          <w:rFonts w:ascii="Arial" w:cs="Arial" w:eastAsia="Arial" w:hAnsi="Arial"/>
+          <w:b/>
+          <w:bCs/>
+          <w:sz w:val="18"/>
+          <w:szCs w:val="18"/>
+        </w:rPr>
+        <w:t xml:space="preserve">Adulte présent ou joignable pendant la séance : </w:t>
       </w:r>
       <w:r>
         <w:rPr>

</xml_diff>

<commit_message>
Soutien scolaire : séance minimale de 1 h (au lieu de 1 h 30)
- Précision du tarif et durée minimale du simulateur (dureeMin: 1)
- CGV article 3, devis et contrat ; modèles régénérés

Co-Authored-By: Claude Opus 5.5 <noreply@anthropic.com>
Claude-Session: https://claude.ai/code/session_01RpHF8nrcPTLKtwPSNGyhP8
</commit_message>
<xml_diff>
--- a/documents/modele-contrat.docx
+++ b/documents/modele-contrat.docx
@@ -801,7 +801,7 @@
           <w:sz w:val="18"/>
           <w:szCs w:val="18"/>
         </w:rPr>
-        <w:t xml:space="preserve">Les interventions ont lieu du lundi au vendredi, de 8 h à 18 h, hors congés annuels. Durée minimale : 2 heures pour le ménage, 1 h 30 pour les autres services. Congés annuels : une semaine en juillet, août, septembre et octobre, deux semaines en décembre. Les dates précises sont communiquées à l'avance ; en cas d'empêchement, la Prestataire prévient le Client dès que possible et, si elle le peut, propose un remplacement ou un report.</w:t>
+        <w:t xml:space="preserve">Les interventions ont lieu du lundi au vendredi, de 8 h à 18 h, hors congés annuels. Durée minimale : 2 heures pour le ménage, 1 heure pour le soutien scolaire. Congés annuels : une semaine en juillet, août, septembre et octobre, deux semaines en décembre. Les dates précises sont communiquées à l'avance ; en cas d'empêchement, la Prestataire prévient le Client dès que possible et, si elle le peut, propose un remplacement ou un report.</w:t>
       </w:r>
     </w:p>
     <w:p>
@@ -1295,7 +1295,7 @@
                 <w:sz w:val="15"/>
                 <w:szCs w:val="15"/>
               </w:rPr>
-              <w:t xml:space="preserve">Séance minimale de 1 h 30.</w:t>
+              <w:t xml:space="preserve">Séance minimale de 1 h.</w:t>
             </w:r>
           </w:p>
         </w:tc>

</xml_diff>